<commit_message>
﻿feat: unify Building domain as POI and update route/admin flows
- rename backend building entity/mapper/service usage to Poi/PoiMapper
- add /api/admin/poi and keep /api/admin/building compatibility entry
- extend route map-data with nodeDetails and POI metadata mapping
- update frontend admin and route planner to POI semantics and location selectors
- add scenic_spot seed type and sync requirements/technical/handoff docs
</commit_message>
<xml_diff>
--- a/docs/Project Plan/项目计划书.docx
+++ b/docs/Project Plan/项目计划书.docx
@@ -6,6 +6,7 @@
       <w:pPr>
         <w:jc w:val="center"/>
         <w:rPr>
+          <w:rFonts w:hint="eastAsia"/>
           <w:b/>
           <w:bCs/>
           <w:sz w:val="56"/>
@@ -17,6 +18,7 @@
       <w:pPr>
         <w:jc w:val="center"/>
         <w:rPr>
+          <w:rFonts w:hint="eastAsia"/>
           <w:b/>
           <w:bCs/>
           <w:sz w:val="56"/>
@@ -28,6 +30,7 @@
       <w:pPr>
         <w:jc w:val="center"/>
         <w:rPr>
+          <w:rFonts w:hint="eastAsia"/>
           <w:b/>
           <w:bCs/>
           <w:sz w:val="56"/>
@@ -73,6 +76,7 @@
       <w:pPr>
         <w:jc w:val="center"/>
         <w:rPr>
+          <w:rFonts w:hint="eastAsia"/>
           <w:b/>
           <w:bCs/>
           <w:sz w:val="72"/>
@@ -301,6 +305,7 @@
             <w:pPr>
               <w:jc w:val="center"/>
               <w:rPr>
+                <w:rFonts w:hint="eastAsia"/>
                 <w:sz w:val="28"/>
                 <w:szCs w:val="32"/>
               </w:rPr>
@@ -326,94 +331,92 @@
                 <w:szCs w:val="32"/>
               </w:rPr>
             </w:pPr>
-            <w:proofErr w:type="gramStart"/>
             <w:r>
               <w:rPr>
                 <w:rFonts w:hint="eastAsia"/>
                 <w:sz w:val="28"/>
                 <w:szCs w:val="32"/>
               </w:rPr>
-              <w:t>Wechat:MaxChen</w:t>
-            </w:r>
-            <w:proofErr w:type="gramEnd"/>
-            <w:r>
+              <w:t>Wechat:MaxChen1122OvO</w:t>
+            </w:r>
+          </w:p>
+        </w:tc>
+      </w:tr>
+      <w:tr>
+        <w:tc>
+          <w:tcPr>
+            <w:tcW w:w="2074" w:type="dxa"/>
+          </w:tcPr>
+          <w:p>
+            <w:pPr>
+              <w:jc w:val="center"/>
               <w:rPr>
                 <w:rFonts w:hint="eastAsia"/>
                 <w:sz w:val="28"/>
                 <w:szCs w:val="32"/>
               </w:rPr>
-              <w:t>1122OvO</w:t>
-            </w:r>
-          </w:p>
-        </w:tc>
-      </w:tr>
-      <w:tr>
-        <w:tc>
-          <w:tcPr>
-            <w:tcW w:w="2074" w:type="dxa"/>
-          </w:tcPr>
-          <w:p>
-            <w:pPr>
-              <w:jc w:val="center"/>
+            </w:pPr>
+            <w:r>
               <w:rPr>
                 <w:rFonts w:hint="eastAsia"/>
                 <w:sz w:val="28"/>
                 <w:szCs w:val="32"/>
               </w:rPr>
-            </w:pPr>
-            <w:r>
+              <w:t>程小路</w:t>
+            </w:r>
+          </w:p>
+        </w:tc>
+        <w:tc>
+          <w:tcPr>
+            <w:tcW w:w="2074" w:type="dxa"/>
+          </w:tcPr>
+          <w:p>
+            <w:pPr>
+              <w:jc w:val="center"/>
               <w:rPr>
                 <w:rFonts w:hint="eastAsia"/>
                 <w:sz w:val="28"/>
                 <w:szCs w:val="32"/>
               </w:rPr>
-              <w:t>程小路</w:t>
-            </w:r>
-          </w:p>
-        </w:tc>
-        <w:tc>
-          <w:tcPr>
-            <w:tcW w:w="2074" w:type="dxa"/>
-          </w:tcPr>
-          <w:p>
-            <w:pPr>
-              <w:jc w:val="center"/>
+            </w:pPr>
+            <w:r>
               <w:rPr>
                 <w:rFonts w:hint="eastAsia"/>
                 <w:sz w:val="28"/>
                 <w:szCs w:val="32"/>
               </w:rPr>
-            </w:pPr>
-            <w:r>
+              <w:t>2024211311</w:t>
+            </w:r>
+          </w:p>
+        </w:tc>
+        <w:tc>
+          <w:tcPr>
+            <w:tcW w:w="2074" w:type="dxa"/>
+          </w:tcPr>
+          <w:p>
+            <w:pPr>
+              <w:jc w:val="center"/>
               <w:rPr>
                 <w:rFonts w:hint="eastAsia"/>
                 <w:sz w:val="28"/>
                 <w:szCs w:val="32"/>
               </w:rPr>
-              <w:t>2024211311</w:t>
-            </w:r>
-          </w:p>
-        </w:tc>
-        <w:tc>
-          <w:tcPr>
-            <w:tcW w:w="2074" w:type="dxa"/>
-          </w:tcPr>
-          <w:p>
-            <w:pPr>
-              <w:jc w:val="center"/>
+            </w:pPr>
+            <w:r>
               <w:rPr>
                 <w:rFonts w:hint="eastAsia"/>
                 <w:sz w:val="28"/>
                 <w:szCs w:val="32"/>
               </w:rPr>
-            </w:pPr>
+              <w:t>202421124</w:t>
+            </w:r>
             <w:r>
               <w:rPr>
                 <w:rFonts w:hint="eastAsia"/>
                 <w:sz w:val="28"/>
                 <w:szCs w:val="32"/>
               </w:rPr>
-              <w:t>2024211240</w:t>
+              <w:t>4</w:t>
             </w:r>
           </w:p>
         </w:tc>
@@ -421,6 +424,80 @@
           <w:tcPr>
             <w:tcW w:w="2074" w:type="dxa"/>
           </w:tcPr>
+          <w:p>
+            <w:pPr>
+              <w:jc w:val="center"/>
+              <w:rPr>
+                <w:rStyle w:val="af4"/>
+              </w:rPr>
+            </w:pPr>
+            <w:hyperlink r:id="rId9" w:history="1">
+              <w:r>
+                <w:rPr>
+                  <w:rStyle w:val="af4"/>
+                  <w:rFonts w:hint="eastAsia"/>
+                  <w:sz w:val="28"/>
+                  <w:szCs w:val="32"/>
+                </w:rPr>
+                <w:t>Tel:1</w:t>
+              </w:r>
+              <w:r>
+                <w:rPr>
+                  <w:rStyle w:val="af4"/>
+                  <w:rFonts w:hint="eastAsia"/>
+                  <w:sz w:val="28"/>
+                  <w:szCs w:val="32"/>
+                </w:rPr>
+                <w:t>8786711323</w:t>
+              </w:r>
+            </w:hyperlink>
+          </w:p>
+          <w:p>
+            <w:pPr>
+              <w:jc w:val="center"/>
+              <w:rPr>
+                <w:rFonts w:hint="eastAsia"/>
+                <w:sz w:val="28"/>
+                <w:szCs w:val="32"/>
+              </w:rPr>
+            </w:pPr>
+            <w:proofErr w:type="spellStart"/>
+            <w:r>
+              <w:rPr>
+                <w:rFonts w:hint="eastAsia"/>
+                <w:sz w:val="28"/>
+                <w:szCs w:val="32"/>
+              </w:rPr>
+              <w:t>Wechat</w:t>
+            </w:r>
+            <w:proofErr w:type="spellEnd"/>
+            <w:r>
+              <w:rPr>
+                <w:rFonts w:hint="eastAsia"/>
+                <w:sz w:val="28"/>
+                <w:szCs w:val="32"/>
+              </w:rPr>
+              <w:t>:</w:t>
+            </w:r>
+            <w:r>
+              <w:rPr>
+                <w:rFonts w:hint="eastAsia"/>
+                <w:sz w:val="28"/>
+                <w:szCs w:val="32"/>
+              </w:rPr>
+              <w:t xml:space="preserve"> </w:t>
+            </w:r>
+            <w:proofErr w:type="spellStart"/>
+            <w:r>
+              <w:rPr>
+                <w:rFonts w:hint="eastAsia"/>
+                <w:sz w:val="28"/>
+                <w:szCs w:val="32"/>
+              </w:rPr>
+              <w:t>Syeutin</w:t>
+            </w:r>
+            <w:proofErr w:type="spellEnd"/>
+          </w:p>
           <w:p>
             <w:pPr>
               <w:jc w:val="center"/>
@@ -437,6 +514,7 @@
     <w:p>
       <w:pPr>
         <w:rPr>
+          <w:rFonts w:hint="eastAsia"/>
           <w:b/>
           <w:bCs/>
         </w:rPr>
@@ -919,6 +997,7 @@
     <w:p>
       <w:pPr>
         <w:rPr>
+          <w:rFonts w:hint="eastAsia"/>
           <w:b/>
           <w:bCs/>
           <w:sz w:val="36"/>
@@ -1013,7 +1092,13 @@
         <w:t>提升用户的旅游体验。</w:t>
       </w:r>
     </w:p>
-    <w:p/>
+    <w:p>
+      <w:pPr>
+        <w:rPr>
+          <w:rFonts w:hint="eastAsia"/>
+        </w:rPr>
+      </w:pPr>
+    </w:p>
     <w:p>
       <w:pPr>
         <w:rPr>
@@ -3704,6 +3789,7 @@
     <w:p>
       <w:pPr>
         <w:rPr>
+          <w:rFonts w:hint="eastAsia"/>
           <w:b/>
           <w:bCs/>
           <w:sz w:val="36"/>
@@ -6951,6 +7037,7 @@
     <w:p>
       <w:pPr>
         <w:rPr>
+          <w:rFonts w:hint="eastAsia"/>
           <w:b/>
           <w:bCs/>
           <w:sz w:val="36"/>
@@ -8951,6 +9038,7 @@
     <w:p>
       <w:pPr>
         <w:rPr>
+          <w:rFonts w:hint="eastAsia"/>
           <w:b/>
           <w:bCs/>
           <w:sz w:val="28"/>
@@ -9034,6 +9122,7 @@
     <w:p>
       <w:pPr>
         <w:rPr>
+          <w:rFonts w:hint="eastAsia"/>
           <w:b/>
           <w:bCs/>
           <w:sz w:val="36"/>
@@ -13690,6 +13779,7 @@
     <w:p>
       <w:pPr>
         <w:rPr>
+          <w:rFonts w:hint="eastAsia"/>
           <w:b/>
           <w:bCs/>
           <w:sz w:val="36"/>
@@ -15658,6 +15748,7 @@
     <w:p>
       <w:pPr>
         <w:rPr>
+          <w:rFonts w:hint="eastAsia"/>
           <w:b/>
           <w:bCs/>
           <w:sz w:val="36"/>
@@ -15668,6 +15759,7 @@
     <w:p>
       <w:pPr>
         <w:rPr>
+          <w:rFonts w:hint="eastAsia"/>
           <w:b/>
           <w:bCs/>
           <w:sz w:val="36"/>
@@ -17582,6 +17674,7 @@
     <w:p>
       <w:pPr>
         <w:rPr>
+          <w:rFonts w:hint="eastAsia"/>
           <w:b/>
           <w:bCs/>
           <w:sz w:val="36"/>
@@ -19400,12 +19493,12 @@
       </w:pPr>
     </w:p>
     <w:sectPr>
-      <w:headerReference w:type="even" r:id="rId9"/>
-      <w:headerReference w:type="default" r:id="rId10"/>
-      <w:footerReference w:type="even" r:id="rId11"/>
-      <w:footerReference w:type="default" r:id="rId12"/>
-      <w:headerReference w:type="first" r:id="rId13"/>
-      <w:footerReference w:type="first" r:id="rId14"/>
+      <w:headerReference w:type="even" r:id="rId10"/>
+      <w:headerReference w:type="default" r:id="rId11"/>
+      <w:footerReference w:type="even" r:id="rId12"/>
+      <w:footerReference w:type="default" r:id="rId13"/>
+      <w:headerReference w:type="first" r:id="rId14"/>
+      <w:footerReference w:type="first" r:id="rId15"/>
       <w:pgSz w:w="11906" w:h="16838"/>
       <w:pgMar w:top="1440" w:right="1800" w:bottom="1440" w:left="1800" w:header="851" w:footer="992" w:gutter="0"/>
       <w:cols w:space="425"/>
@@ -23763,6 +23856,7 @@
   <w:style w:type="character" w:default="1" w:styleId="a0">
     <w:name w:val="Default Paragraph Font"/>
     <w:uiPriority w:val="1"/>
+    <w:semiHidden/>
     <w:unhideWhenUsed/>
   </w:style>
   <w:style w:type="table" w:default="1" w:styleId="a1">

</xml_diff>